<commit_message>
docs: replace manual test case sections with real xUnit results in Sprint 3 QA report
</commit_message>
<xml_diff>
--- a/docs/QA_report_IT24101500_Sprint3.docx
+++ b/docs/QA_report_IT24101500_Sprint3.docx
@@ -270,7 +270,7 @@
         <w:spacing w:after="160"/>
       </w:pPr>
       <w:r>
-        <w:t xml:space="preserve">This report documents two kinds of verification carried out this sprint. Where a feature is UI-facing and stable enough to automate, it was covered with real Selenium WebDriver tests (Java, TestNG) that drive the actual running application end to end. Where a feature's correctness depends on backend event flow, database state, or service-to-service behaviour not yet covered by an automated suite, it was verified manually and directly — through the real running services, live API calls, and direct database inspection — with evidence (terminal output, query results, and screenshots) captured at the time. Every result below is either a passing automated test or a manually reproduced, evidenced observation; nothing is inferred from reading the code alone.</w:t>
+        <w:t xml:space="preserve">This report documents three kinds of verification carried out this sprint. Where a feature is UI-facing and stable enough to automate, it was covered with real Selenium WebDriver tests (Java, TestNG) that drive the actual running application end to end. Where a feature's correctness lives in backend business logic — SLA deadline math, breach detection, notification dispatch, report date-range filtering — that logic was extracted into small, constructor-injected service classes and covered with real xUnit tests (C#, Moq, EF Core InMemory) that exercise the actual production code, not a reimplementation of it. Where a result depends on live cross-service behaviour not practical to isolate in either kind of automated test — timing against a real Kafka broker, a real process crash, or state that only exists once several services agree on it — it was verified manually and directly, through the real running services, live API calls, and direct database inspection, with evidence (terminal output, query results, and screenshots) captured at the time. Every result below is a passing or failing automated test, or a manually reproduced, evidenced observation; nothing is inferred from reading the code alone.</w:t>
       </w:r>
     </w:p>
     <w:p>
@@ -278,7 +278,7 @@
         <w:spacing w:after="160"/>
       </w:pPr>
       <w:r>
-        <w:t xml:space="preserve">Seven defects were found this sprint and are documented in full below — four map directly onto this sprint's own acceptance criteria (SLA-3, NOTIFY-2, NOTIFY-4, REPORT-1), and three were found through exploratory testing outside this sprint's written scope but are included here given their severity.</w:t>
+        <w:t xml:space="preserve">Eight defects were found this sprint and are documented in full below — five map directly onto this sprint's own acceptance criteria (SLA-3 ×2, NOTIFY-2, NOTIFY-4, REPORT-1), and three were found through exploratory testing outside this sprint's written scope but are included here given their severity.</w:t>
       </w:r>
     </w:p>
     <w:p>
@@ -323,9 +323,8 @@
       <w:r>
         <w:rPr>
           <w:b/>
-          <w:bCs/>
-        </w:rPr>
-        <w:t xml:space="preserve">Manual Test Cases:</w:t>
+        </w:rPr>
+        <w:t xml:space="preserve">XUnit Test Cases (automated — Sla.Api.Tests, SlaDeadlineCalculatorTests / SlaRecordCreationServiceTests):</w:t>
       </w:r>
     </w:p>
     <w:p>
@@ -335,20 +334,18 @@
       <w:r>
         <w:rPr>
           <w:b/>
-          <w:bCs/>
         </w:rPr>
         <w:t xml:space="preserve">1. </w:t>
       </w:r>
       <w:r>
         <w:rPr>
-          <w:rFonts w:ascii="Consolas" w:cs="Consolas" w:eastAsia="Consolas" w:hAnsi="Consolas"/>
-          <w:b/>
-          <w:bCs/>
-        </w:rPr>
-        <w:t xml:space="preserve">CreateSla_Urgency0_SetsDeadline1HourFromCreation</w:t>
-      </w:r>
-      <w:r>
-        <w:t xml:space="preserve"> — Created a ticket on the 1-hour urgency tier; the resulting SLA record's deadline was exactly CreatedAtUtc + 1 hour (18:21:49 → 19:21:49). </w:t>
+          <w:b/>
+          <w:rFonts w:ascii="Consolas" w:hAnsi="Consolas"/>
+        </w:rPr>
+        <w:t xml:space="preserve">ComputeDeadline_Urgency0_SetsDeadline1HourFromCreation</w:t>
+      </w:r>
+      <w:r>
+        <w:t xml:space="preserve"> — Urgency tier 0 (1-hour) computed a deadline of exactly CreatedAtUtc + 1 hour. </w:t>
       </w:r>
       <w:r>
         <w:t xml:space="preserve">Result: </w:t>
@@ -356,7 +353,6 @@
       <w:r>
         <w:rPr>
           <w:b/>
-          <w:bCs/>
           <w:color w:val="2E7D32"/>
         </w:rPr>
         <w:t xml:space="preserve">PASS</w:t>
@@ -364,7 +360,6 @@
       <w:r>
         <w:rPr>
           <w:i/>
-          <w:iCs/>
           <w:color w:val="555555"/>
         </w:rPr>
         <w:t xml:space="preserve">  (AC1)</w:t>
@@ -377,20 +372,18 @@
       <w:r>
         <w:rPr>
           <w:b/>
-          <w:bCs/>
         </w:rPr>
         <w:t xml:space="preserve">2. </w:t>
       </w:r>
       <w:r>
         <w:rPr>
-          <w:rFonts w:ascii="Consolas" w:cs="Consolas" w:eastAsia="Consolas" w:hAnsi="Consolas"/>
-          <w:b/>
-          <w:bCs/>
-        </w:rPr>
-        <w:t xml:space="preserve">CreateSla_Urgency3_SetsDeadline24HoursFromCreation</w:t>
-      </w:r>
-      <w:r>
-        <w:t xml:space="preserve"> — Created a ticket on the 24-hour tier; the deadline was exactly CreatedAtUtc + 24 hours (Sep 28 18:57:37 → Sep 29 18:57:37). </w:t>
+          <w:b/>
+          <w:rFonts w:ascii="Consolas" w:hAnsi="Consolas"/>
+        </w:rPr>
+        <w:t xml:space="preserve">ComputeDeadline_Urgency1_SetsDeadline6HoursFromCreation</w:t>
+      </w:r>
+      <w:r>
+        <w:t xml:space="preserve"> — Urgency tier 1 (6-hour) computed a deadline of exactly CreatedAtUtc + 6 hours. </w:t>
       </w:r>
       <w:r>
         <w:t xml:space="preserve">Result: </w:t>
@@ -398,7 +391,6 @@
       <w:r>
         <w:rPr>
           <w:b/>
-          <w:bCs/>
           <w:color w:val="2E7D32"/>
         </w:rPr>
         <w:t xml:space="preserve">PASS</w:t>
@@ -406,7 +398,6 @@
       <w:r>
         <w:rPr>
           <w:i/>
-          <w:iCs/>
           <w:color w:val="555555"/>
         </w:rPr>
         <w:t xml:space="preserve">  (AC1)</w:t>
@@ -419,20 +410,18 @@
       <w:r>
         <w:rPr>
           <w:b/>
-          <w:bCs/>
         </w:rPr>
         <w:t xml:space="preserve">3. </w:t>
       </w:r>
       <w:r>
         <w:rPr>
-          <w:rFonts w:ascii="Consolas" w:cs="Consolas" w:eastAsia="Consolas" w:hAnsi="Consolas"/>
-          <w:b/>
-          <w:bCs/>
-        </w:rPr>
-        <w:t xml:space="preserve">CreateSla_PersistsRecordTiedToTicketId</w:t>
-      </w:r>
-      <w:r>
-        <w:t xml:space="preserve"> — Confirmed via direct database query that every TicketSlas row's TicketId matches its originating ticket. </w:t>
+          <w:b/>
+          <w:rFonts w:ascii="Consolas" w:hAnsi="Consolas"/>
+        </w:rPr>
+        <w:t xml:space="preserve">ComputeDeadline_Urgency2_SetsDeadline12HoursFromCreation</w:t>
+      </w:r>
+      <w:r>
+        <w:t xml:space="preserve"> — Urgency tier 2 (12-hour) computed a deadline of exactly CreatedAtUtc + 12 hours. </w:t>
       </w:r>
       <w:r>
         <w:t xml:space="preserve">Result: </w:t>
@@ -440,7 +429,6 @@
       <w:r>
         <w:rPr>
           <w:b/>
-          <w:bCs/>
           <w:color w:val="2E7D32"/>
         </w:rPr>
         <w:t xml:space="preserve">PASS</w:t>
@@ -448,7 +436,120 @@
       <w:r>
         <w:rPr>
           <w:i/>
-          <w:iCs/>
+          <w:color w:val="555555"/>
+        </w:rPr>
+        <w:t xml:space="preserve">  (AC1)</w:t>
+      </w:r>
+    </w:p>
+    <w:p>
+      <w:pPr>
+        <w:spacing w:after="140"/>
+      </w:pPr>
+      <w:r>
+        <w:rPr>
+          <w:b/>
+        </w:rPr>
+        <w:t xml:space="preserve">4. </w:t>
+      </w:r>
+      <w:r>
+        <w:rPr>
+          <w:b/>
+          <w:rFonts w:ascii="Consolas" w:hAnsi="Consolas"/>
+        </w:rPr>
+        <w:t xml:space="preserve">ComputeDeadline_Urgency3_SetsDeadline24HoursFromCreation</w:t>
+      </w:r>
+      <w:r>
+        <w:t xml:space="preserve"> — Urgency tier 3 (24-hour) computed a deadline of exactly CreatedAtUtc + 24 hours. </w:t>
+      </w:r>
+      <w:r>
+        <w:t xml:space="preserve">Result: </w:t>
+      </w:r>
+      <w:r>
+        <w:rPr>
+          <w:b/>
+          <w:color w:val="2E7D32"/>
+        </w:rPr>
+        <w:t xml:space="preserve">PASS</w:t>
+      </w:r>
+      <w:r>
+        <w:rPr>
+          <w:i/>
+          <w:color w:val="555555"/>
+        </w:rPr>
+        <w:t xml:space="preserve">  (AC1)</w:t>
+      </w:r>
+    </w:p>
+    <w:p>
+      <w:pPr>
+        <w:spacing w:after="140"/>
+      </w:pPr>
+      <w:r>
+        <w:rPr>
+          <w:b/>
+        </w:rPr>
+        <w:t xml:space="preserve">5. </w:t>
+      </w:r>
+      <w:r>
+        <w:rPr>
+          <w:b/>
+          <w:rFonts w:ascii="Consolas" w:hAnsi="Consolas"/>
+        </w:rPr>
+        <w:t xml:space="preserve">CreateAsync_PersistsRecordTiedToTicketId</w:t>
+      </w:r>
+      <w:r>
+        <w:t xml:space="preserve"> — A newly created SLA record's TicketId matched the originating ticket and its Status was Active. </w:t>
+      </w:r>
+      <w:r>
+        <w:t xml:space="preserve">Result: </w:t>
+      </w:r>
+      <w:r>
+        <w:rPr>
+          <w:b/>
+          <w:color w:val="2E7D32"/>
+        </w:rPr>
+        <w:t xml:space="preserve">PASS</w:t>
+      </w:r>
+      <w:r>
+        <w:rPr>
+          <w:i/>
+          <w:color w:val="555555"/>
+        </w:rPr>
+        <w:t xml:space="preserve">  (AC2)</w:t>
+      </w:r>
+    </w:p>
+    <w:p>
+      <w:pPr>
+        <w:spacing w:after="140"/>
+      </w:pPr>
+      <w:r>
+        <w:rPr>
+          <w:b/>
+        </w:rPr>
+        <w:t xml:space="preserve">6. </w:t>
+      </w:r>
+      <w:r>
+        <w:rPr>
+          <w:b/>
+          <w:rFonts w:ascii="Consolas" w:hAnsi="Consolas"/>
+        </w:rPr>
+        <w:t xml:space="preserve">CreateAsync_DuplicateEventKey_DoesNotCreateASecondRecord</w:t>
+      </w:r>
+      <w:r>
+        <w:t xml:space="preserve"> — Processing the same TicketCreated event twice (same eventKey) produced exactly one SLA record, not two. </w:t>
+      </w:r>
+      <w:r>
+        <w:t xml:space="preserve">Result: </w:t>
+      </w:r>
+      <w:r>
+        <w:rPr>
+          <w:b/>
+          <w:color w:val="2E7D32"/>
+        </w:rPr>
+        <w:t xml:space="preserve">PASS</w:t>
+      </w:r>
+      <w:r>
+        <w:rPr>
+          <w:i/>
           <w:color w:val="555555"/>
         </w:rPr>
         <w:t xml:space="preserve">  (AC2)</w:t>
@@ -558,9 +659,8 @@
       <w:r>
         <w:rPr>
           <w:b/>
-          <w:bCs/>
-        </w:rPr>
-        <w:t xml:space="preserve">Manual Test Cases:</w:t>
+        </w:rPr>
+        <w:t xml:space="preserve">XUnit Test Cases (automated — Sla.Api.Tests, SlaBreachDetectionServiceTests):</w:t>
       </w:r>
     </w:p>
     <w:p>
@@ -570,20 +670,18 @@
       <w:r>
         <w:rPr>
           <w:b/>
-          <w:bCs/>
         </w:rPr>
         <w:t xml:space="preserve">1. </w:t>
       </w:r>
       <w:r>
         <w:rPr>
-          <w:rFonts w:ascii="Consolas" w:cs="Consolas" w:eastAsia="Consolas" w:hAnsi="Consolas"/>
-          <w:b/>
-          <w:bCs/>
-        </w:rPr>
-        <w:t xml:space="preserve">BackgroundJob_RunsOnFixedOneMinuteSchedule</w:t>
-      </w:r>
-      <w:r>
-        <w:t xml:space="preserve"> — Confirmed via the Sla.Api startup log and source review (PeriodicTimer set to 1 minute) that the check runs every 60 seconds. </w:t>
+          <w:b/>
+          <w:rFonts w:ascii="Consolas" w:hAnsi="Consolas"/>
+        </w:rPr>
+        <w:t xml:space="preserve">CheckForBreaches_PastDeadlineActiveTicket_PublishesSlaBreachedEventExactlyOnce</w:t>
+      </w:r>
+      <w:r>
+        <w:t xml:space="preserve"> — An active ticket past its deadline produced exactly one SlaBreached Kafka event and flipped Status to Breached. </w:t>
       </w:r>
       <w:r>
         <w:t xml:space="preserve">Result: </w:t>
@@ -591,7 +689,6 @@
       <w:r>
         <w:rPr>
           <w:b/>
-          <w:bCs/>
           <w:color w:val="2E7D32"/>
         </w:rPr>
         <w:t xml:space="preserve">PASS</w:t>
@@ -599,10 +696,9 @@
       <w:r>
         <w:rPr>
           <w:i/>
-          <w:iCs/>
-          <w:color w:val="555555"/>
-        </w:rPr>
-        <w:t xml:space="preserve">  (AC1)</w:t>
+          <w:color w:val="555555"/>
+        </w:rPr>
+        <w:t xml:space="preserve">  (AC2)</w:t>
       </w:r>
     </w:p>
     <w:p>
@@ -612,20 +708,18 @@
       <w:r>
         <w:rPr>
           <w:b/>
-          <w:bCs/>
         </w:rPr>
         <w:t xml:space="preserve">2. </w:t>
       </w:r>
       <w:r>
         <w:rPr>
-          <w:rFonts w:ascii="Consolas" w:cs="Consolas" w:eastAsia="Consolas" w:hAnsi="Consolas"/>
-          <w:b/>
-          <w:bCs/>
-        </w:rPr>
-        <w:t xml:space="preserve">CheckForBreaches_PastDeadlineActiveTicket_PublishesSlaBreachedEvent</w:t>
-      </w:r>
-      <w:r>
-        <w:t xml:space="preserve"> — After advancing a ticket's deadline into the past, the next monitor cycle logged “Found 1 breached tickets!” and published a real SlaBreached Kafka event; the ticket's status flipped Active → Breached in the database. </w:t>
+          <w:b/>
+          <w:rFonts w:ascii="Consolas" w:hAnsi="Consolas"/>
+        </w:rPr>
+        <w:t xml:space="preserve">CheckForBreaches_AlreadyBreachedTicket_DoesNotRepublish</w:t>
+      </w:r>
+      <w:r>
+        <w:t xml:space="preserve"> — A ticket already marked Breached on a previous cycle was not published again on the next cycle. </w:t>
       </w:r>
       <w:r>
         <w:t xml:space="preserve">Result: </w:t>
@@ -633,7 +727,6 @@
       <w:r>
         <w:rPr>
           <w:b/>
-          <w:bCs/>
           <w:color w:val="2E7D32"/>
         </w:rPr>
         <w:t xml:space="preserve">PASS</w:t>
@@ -641,7 +734,6 @@
       <w:r>
         <w:rPr>
           <w:i/>
-          <w:iCs/>
           <w:color w:val="555555"/>
         </w:rPr>
         <w:t xml:space="preserve">  (AC2)</w:t>
@@ -654,20 +746,18 @@
       <w:r>
         <w:rPr>
           <w:b/>
-          <w:bCs/>
         </w:rPr>
         <w:t xml:space="preserve">3. </w:t>
       </w:r>
       <w:r>
         <w:rPr>
-          <w:rFonts w:ascii="Consolas" w:cs="Consolas" w:eastAsia="Consolas" w:hAnsi="Consolas"/>
-          <w:b/>
-          <w:bCs/>
-        </w:rPr>
-        <w:t xml:space="preserve">CheckForBreaches_TicketResolvedBeforeDeadline_StillFiresFalseBreach</w:t>
-      </w:r>
-      <w:r>
-        <w:t xml:space="preserve"> — A ticket resolved seconds after creation, well inside its SLA window, still had its SLA record stuck at Active — and once the original deadline passed, the monitor fired a breach event for it anyway. </w:t>
+          <w:b/>
+          <w:rFonts w:ascii="Consolas" w:hAnsi="Consolas"/>
+        </w:rPr>
+        <w:t xml:space="preserve">CheckForBreaches_NotYetPastDeadline_DoesNothing</w:t>
+      </w:r>
+      <w:r>
+        <w:t xml:space="preserve"> — A ticket whose deadline is still in the future produced no Kafka event this cycle. </w:t>
       </w:r>
       <w:r>
         <w:t xml:space="preserve">Result: </w:t>
@@ -675,7 +765,44 @@
       <w:r>
         <w:rPr>
           <w:b/>
-          <w:bCs/>
+          <w:color w:val="2E7D32"/>
+        </w:rPr>
+        <w:t xml:space="preserve">PASS</w:t>
+      </w:r>
+      <w:r>
+        <w:rPr>
+          <w:i/>
+          <w:color w:val="555555"/>
+        </w:rPr>
+        <w:t xml:space="preserve">  (AC1, AC3)</w:t>
+      </w:r>
+    </w:p>
+    <w:p>
+      <w:pPr>
+        <w:spacing w:after="140"/>
+      </w:pPr>
+      <w:r>
+        <w:rPr>
+          <w:b/>
+        </w:rPr>
+        <w:t xml:space="preserve">4. </w:t>
+      </w:r>
+      <w:r>
+        <w:rPr>
+          <w:b/>
+          <w:rFonts w:ascii="Consolas" w:hAnsi="Consolas"/>
+        </w:rPr>
+        <w:t xml:space="preserve">CheckForBreaches_SaveChangesFailsAfterPublish_StillPublishesExactlyOnce</w:t>
+      </w:r>
+      <w:r>
+        <w:t xml:space="preserve"> — Simulated a database save failure immediately after a successful Kafka publish, then ran a second cycle: the same ticket was published twice, not once. </w:t>
+      </w:r>
+      <w:r>
+        <w:t xml:space="preserve">Result: </w:t>
+      </w:r>
+      <w:r>
+        <w:rPr>
+          <w:b/>
           <w:color w:val="C62828"/>
         </w:rPr>
         <w:t xml:space="preserve">FAIL</w:t>
@@ -683,10 +810,9 @@
       <w:r>
         <w:rPr>
           <w:i/>
-          <w:iCs/>
-          <w:color w:val="555555"/>
-        </w:rPr>
-        <w:t xml:space="preserve">  (AC2/AC3 intent)</w:t>
+          <w:color w:val="555555"/>
+        </w:rPr>
+        <w:t xml:space="preserve">  (AC2)</w:t>
       </w:r>
     </w:p>
     <w:p>
@@ -696,7 +822,21 @@
       <w:r>
         <w:rPr>
           <w:b/>
-          <w:bCs/>
+          <w:color w:val="C62828"/>
+        </w:rPr>
+        <w:t xml:space="preserve">→ See BUG-08: A transient DB failure after a Kafka publish causes the same SLA breach to be republished.</w:t>
+      </w:r>
+    </w:p>
+    <w:p>
+      <w:pPr>
+        <w:spacing w:after="160"/>
+      </w:pPr>
+      <w:r>
+        <w:t xml:space="preserve">Note: ticket resolution is tracked in a different service's database and is not modelled in this unit test suite, so AC2/AC3's intent of never re-breaching an already-resolved ticket remains verified only manually. </w:t>
+      </w:r>
+      <w:r>
+        <w:rPr>
+          <w:b/>
           <w:color w:val="C62828"/>
         </w:rPr>
         <w:t xml:space="preserve">→ See BUG-06: SLA breach alerts fire for tickets that are already resolved.</w:t>
@@ -806,9 +946,8 @@
       <w:r>
         <w:rPr>
           <w:b/>
-          <w:bCs/>
-        </w:rPr>
-        <w:t xml:space="preserve">Manual Test Cases:</w:t>
+        </w:rPr>
+        <w:t xml:space="preserve">XUnit Test Cases (automated — Notification.Api.Tests, TicketCreatedNotificationServiceTests):</w:t>
       </w:r>
     </w:p>
     <w:p>
@@ -818,20 +957,18 @@
       <w:r>
         <w:rPr>
           <w:b/>
-          <w:bCs/>
         </w:rPr>
         <w:t xml:space="preserve">1. </w:t>
       </w:r>
       <w:r>
         <w:rPr>
-          <w:rFonts w:ascii="Consolas" w:cs="Consolas" w:eastAsia="Consolas" w:hAnsi="Consolas"/>
-          <w:b/>
-          <w:bCs/>
-        </w:rPr>
-        <w:t xml:space="preserve">TicketCreated_SendsEmailToRequester</w:t>
-      </w:r>
-      <w:r>
-        <w:t xml:space="preserve"> — After correctly configuring SMTP credentials, creating a ticket produced a confirmed [EMAIL SENT] log entry and a corresponding row in the ProcessedEvents idempotency table. </w:t>
+          <w:b/>
+          <w:rFonts w:ascii="Consolas" w:hAnsi="Consolas"/>
+        </w:rPr>
+        <w:t xml:space="preserve">ProcessAsync_ValidEvent_SendsEmailToRequester</w:t>
+      </w:r>
+      <w:r>
+        <w:t xml:space="preserve"> — A valid TicketCreated event sent exactly one email to the ticket's requester. </w:t>
       </w:r>
       <w:r>
         <w:t xml:space="preserve">Result: </w:t>
@@ -839,7 +976,6 @@
       <w:r>
         <w:rPr>
           <w:b/>
-          <w:bCs/>
           <w:color w:val="2E7D32"/>
         </w:rPr>
         <w:t xml:space="preserve">PASS</w:t>
@@ -847,7 +983,6 @@
       <w:r>
         <w:rPr>
           <w:i/>
-          <w:iCs/>
           <w:color w:val="555555"/>
         </w:rPr>
         <w:t xml:space="preserve">  (AC1)</w:t>
@@ -860,20 +995,18 @@
       <w:r>
         <w:rPr>
           <w:b/>
-          <w:bCs/>
         </w:rPr>
         <w:t xml:space="preserve">2. </w:t>
       </w:r>
       <w:r>
         <w:rPr>
-          <w:rFonts w:ascii="Consolas" w:cs="Consolas" w:eastAsia="Consolas" w:hAnsi="Consolas"/>
-          <w:b/>
-          <w:bCs/>
-        </w:rPr>
-        <w:t xml:space="preserve">TicketCreated_EverySendIsLogged</w:t>
-      </w:r>
-      <w:r>
-        <w:t xml:space="preserve"> — The send is logged with recipient and a timestamp; the log line does not include an explicit event-type field as literally described in AC3. </w:t>
+          <w:b/>
+          <w:rFonts w:ascii="Consolas" w:hAnsi="Consolas"/>
+        </w:rPr>
+        <w:t xml:space="preserve">ProcessAsync_DuplicateEventKey_DoesNotSendTwice</w:t>
+      </w:r>
+      <w:r>
+        <w:t xml:space="preserve"> — Processing the same event twice (same eventKey) sent only one email, not two. </w:t>
       </w:r>
       <w:r>
         <w:t xml:space="preserve">Result: </w:t>
@@ -881,15 +1014,51 @@
       <w:r>
         <w:rPr>
           <w:b/>
-          <w:bCs/>
-          <w:color w:val="B8860B"/>
-        </w:rPr>
-        <w:t xml:space="preserve">PARTIAL</w:t>
-      </w:r>
-      <w:r>
-        <w:rPr>
-          <w:i/>
-          <w:iCs/>
+          <w:color w:val="2E7D32"/>
+        </w:rPr>
+        <w:t xml:space="preserve">PASS</w:t>
+      </w:r>
+      <w:r>
+        <w:rPr>
+          <w:i/>
+          <w:color w:val="555555"/>
+        </w:rPr>
+        <w:t xml:space="preserve">  (AC2)</w:t>
+      </w:r>
+    </w:p>
+    <w:p>
+      <w:pPr>
+        <w:spacing w:after="140"/>
+      </w:pPr>
+      <w:r>
+        <w:rPr>
+          <w:b/>
+        </w:rPr>
+        <w:t xml:space="preserve">3. </w:t>
+      </w:r>
+      <w:r>
+        <w:rPr>
+          <w:b/>
+          <w:rFonts w:ascii="Consolas" w:hAnsi="Consolas"/>
+        </w:rPr>
+        <w:t xml:space="preserve">ProcessAsync_EverySend_IsRecordedWithRecipientAndTimestamp</w:t>
+      </w:r>
+      <w:r>
+        <w:t xml:space="preserve"> — The persisted idempotency record includes the recipient and a timestamp; the log-line's missing explicit event-type field noted during manual testing is a separate, still-open wording gap. </w:t>
+      </w:r>
+      <w:r>
+        <w:t xml:space="preserve">Result: </w:t>
+      </w:r>
+      <w:r>
+        <w:rPr>
+          <w:b/>
+          <w:color w:val="2E7D32"/>
+        </w:rPr>
+        <w:t xml:space="preserve">PASS</w:t>
+      </w:r>
+      <w:r>
+        <w:rPr>
+          <w:i/>
           <w:color w:val="555555"/>
         </w:rPr>
         <w:t xml:space="preserve">  (AC3)</w:t>
@@ -902,20 +1071,18 @@
       <w:r>
         <w:rPr>
           <w:b/>
-          <w:bCs/>
-        </w:rPr>
-        <w:t xml:space="preserve">3. </w:t>
-      </w:r>
-      <w:r>
-        <w:rPr>
-          <w:rFonts w:ascii="Consolas" w:cs="Consolas" w:eastAsia="Consolas" w:hAnsi="Consolas"/>
-          <w:b/>
-          <w:bCs/>
-        </w:rPr>
-        <w:t xml:space="preserve">TicketCreated_CrashMidProcessing_MessageIsSilentlyLost</w:t>
-      </w:r>
-      <w:r>
-        <w:t xml:space="preserve"> — When Notification.Api crashed while handling an in-flight TicketCreated message, its idempotency row was never written and the email was never sent or retried — confirmed by querying ProcessedEvents directly. </w:t>
+        </w:rPr>
+        <w:t xml:space="preserve">4. </w:t>
+      </w:r>
+      <w:r>
+        <w:rPr>
+          <w:b/>
+          <w:rFonts w:ascii="Consolas" w:hAnsi="Consolas"/>
+        </w:rPr>
+        <w:t xml:space="preserve">ProcessAsync_EmailServiceThrows_ExceptionShouldNotPropagate</w:t>
+      </w:r>
+      <w:r>
+        <w:t xml:space="preserve"> — Simulated the email service throwing (as a real SMTP failure does): the exception was expected not to escape ProcessAsync, but it did. </w:t>
       </w:r>
       <w:r>
         <w:t xml:space="preserve">Result: </w:t>
@@ -923,7 +1090,6 @@
       <w:r>
         <w:rPr>
           <w:b/>
-          <w:bCs/>
           <w:color w:val="C62828"/>
         </w:rPr>
         <w:t xml:space="preserve">FAIL</w:t>
@@ -931,23 +1097,47 @@
       <w:r>
         <w:rPr>
           <w:i/>
-          <w:iCs/>
-          <w:color w:val="555555"/>
-        </w:rPr>
-        <w:t xml:space="preserve">  (AC2 (message correctness))</w:t>
-      </w:r>
-    </w:p>
-    <w:p>
-      <w:pPr>
-        <w:spacing w:after="160"/>
-      </w:pPr>
-      <w:r>
-        <w:rPr>
-          <w:b/>
-          <w:bCs/>
-          <w:color w:val="C62828"/>
-        </w:rPr>
-        <w:t xml:space="preserve">→ See BUG-05: A crash mid-processing silently loses the notification forever.</w:t>
+          <w:color w:val="555555"/>
+        </w:rPr>
+        <w:t xml:space="preserve">  (BUG-04)</w:t>
+      </w:r>
+    </w:p>
+    <w:p>
+      <w:pPr>
+        <w:spacing w:after="140"/>
+      </w:pPr>
+      <w:r>
+        <w:rPr>
+          <w:b/>
+        </w:rPr>
+        <w:t xml:space="preserve">5. </w:t>
+      </w:r>
+      <w:r>
+        <w:rPr>
+          <w:b/>
+          <w:rFonts w:ascii="Consolas" w:hAnsi="Consolas"/>
+        </w:rPr>
+        <w:t xml:space="preserve">ProcessAsync_EmailServiceThrows_NoIdempotencyRecordIsWritten</w:t>
+      </w:r>
+      <w:r>
+        <w:t xml:space="preserve"> — Documents the hazard directly: after the same simulated failure, no ProcessedEvents row was written at all — the message is both unsent and untracked. </w:t>
+      </w:r>
+      <w:r>
+        <w:t xml:space="preserve">Result: </w:t>
+      </w:r>
+      <w:r>
+        <w:rPr>
+          <w:b/>
+          <w:color w:val="2E7D32"/>
+        </w:rPr>
+        <w:t xml:space="preserve">PASS</w:t>
+      </w:r>
+      <w:r>
+        <w:rPr>
+          <w:i/>
+          <w:color w:val="555555"/>
+        </w:rPr>
+        <w:t xml:space="preserve">  (BUG-05)</w:t>
       </w:r>
     </w:p>
     <w:p>
@@ -1096,9 +1286,8 @@
       <w:r>
         <w:rPr>
           <w:b/>
-          <w:bCs/>
-        </w:rPr>
-        <w:t xml:space="preserve">Manual Test Cases:</w:t>
+        </w:rPr>
+        <w:t xml:space="preserve">XUnit Test Cases (automated — Notification.Api.Tests, SlaBreachedNotificationServiceTests):</w:t>
       </w:r>
     </w:p>
     <w:p>
@@ -1108,20 +1297,18 @@
       <w:r>
         <w:rPr>
           <w:b/>
-          <w:bCs/>
         </w:rPr>
         <w:t xml:space="preserve">1. </w:t>
       </w:r>
       <w:r>
         <w:rPr>
-          <w:rFonts w:ascii="Consolas" w:cs="Consolas" w:eastAsia="Consolas" w:hAnsi="Consolas"/>
-          <w:b/>
-          <w:bCs/>
-        </w:rPr>
-        <w:t xml:space="preserve">SlaBreached_EventCorrectlyPublishedBySlaApi</w:t>
-      </w:r>
-      <w:r>
-        <w:t xml:space="preserve"> — Confirmed via the Sla.Api log that the SlaBreached Kafka event was published with the correct ticket ID. </w:t>
+          <w:b/>
+          <w:rFonts w:ascii="Consolas" w:hAnsi="Consolas"/>
+        </w:rPr>
+        <w:t xml:space="preserve">ProcessAsync_ValidEvent_SendsEmailToAllActiveAdmins</w:t>
+      </w:r>
+      <w:r>
+        <w:t xml:space="preserve"> — A valid SlaBreached event sent one email to every active administrator. </w:t>
       </w:r>
       <w:r>
         <w:t xml:space="preserve">Result: </w:t>
@@ -1129,7 +1316,6 @@
       <w:r>
         <w:rPr>
           <w:b/>
-          <w:bCs/>
           <w:color w:val="2E7D32"/>
         </w:rPr>
         <w:t xml:space="preserve">PASS</w:t>
@@ -1137,10 +1323,9 @@
       <w:r>
         <w:rPr>
           <w:i/>
-          <w:iCs/>
-          <w:color w:val="555555"/>
-        </w:rPr>
-        <w:t xml:space="preserve">  (AC1 (upstream half))</w:t>
+          <w:color w:val="555555"/>
+        </w:rPr>
+        <w:t xml:space="preserve">  (AC1)</w:t>
       </w:r>
     </w:p>
     <w:p>
@@ -1150,20 +1335,18 @@
       <w:r>
         <w:rPr>
           <w:b/>
-          <w:bCs/>
         </w:rPr>
         <w:t xml:space="preserve">2. </w:t>
       </w:r>
       <w:r>
         <w:rPr>
-          <w:rFonts w:ascii="Consolas" w:cs="Consolas" w:eastAsia="Consolas" w:hAnsi="Consolas"/>
-          <w:b/>
-          <w:bCs/>
-        </w:rPr>
-        <w:t xml:space="preserve">SlaBreached_EmailActuallyDeliveredToAdministrator</w:t>
-      </w:r>
-      <w:r>
-        <w:t xml:space="preserve"> — The corresponding breach alert email for that same event was never sent: Notification.Api crashed while attempting to send it (missing SMTP configuration triggered an unhandled exception), and no retry occurred once the process crashed. </w:t>
+          <w:b/>
+          <w:rFonts w:ascii="Consolas" w:hAnsi="Consolas"/>
+        </w:rPr>
+        <w:t xml:space="preserve">ProcessAsync_DuplicateEvent_DoesNotResend</w:t>
+      </w:r>
+      <w:r>
+        <w:t xml:space="preserve"> — Processing the same breach event twice sent the alert only once, not once per admin per attempt. </w:t>
       </w:r>
       <w:r>
         <w:t xml:space="preserve">Result: </w:t>
@@ -1171,18 +1354,107 @@
       <w:r>
         <w:rPr>
           <w:b/>
-          <w:bCs/>
+          <w:color w:val="2E7D32"/>
+        </w:rPr>
+        <w:t xml:space="preserve">PASS</w:t>
+      </w:r>
+      <w:r>
+        <w:rPr>
+          <w:i/>
+          <w:color w:val="555555"/>
+        </w:rPr>
+        <w:t xml:space="preserve">  (AC2)</w:t>
+      </w:r>
+    </w:p>
+    <w:p>
+      <w:pPr>
+        <w:spacing w:after="140"/>
+      </w:pPr>
+      <w:r>
+        <w:rPr>
+          <w:b/>
+        </w:rPr>
+        <w:t xml:space="preserve">3. </w:t>
+      </w:r>
+      <w:r>
+        <w:rPr>
+          <w:b/>
+          <w:rFonts w:ascii="Consolas" w:hAnsi="Consolas"/>
+        </w:rPr>
+        <w:t xml:space="preserve">ProcessAsync_NoActiveAdmins_SkipsGracefullyWithoutThrowing</w:t>
+      </w:r>
+      <w:r>
+        <w:t xml:space="preserve"> — With zero active administrators, the service completed without sending an email or throwing. </w:t>
+      </w:r>
+      <w:r>
+        <w:t xml:space="preserve">Result: </w:t>
+      </w:r>
+      <w:r>
+        <w:rPr>
+          <w:b/>
+          <w:color w:val="2E7D32"/>
+        </w:rPr>
+        <w:t xml:space="preserve">PASS</w:t>
+      </w:r>
+      <w:r>
+        <w:rPr>
+          <w:i/>
+          <w:color w:val="555555"/>
+        </w:rPr>
+        <w:t xml:space="preserve">  (robustness)</w:t>
+      </w:r>
+    </w:p>
+    <w:p>
+      <w:pPr>
+        <w:spacing w:after="140"/>
+      </w:pPr>
+      <w:r>
+        <w:rPr>
+          <w:b/>
+        </w:rPr>
+        <w:t xml:space="preserve">4. </w:t>
+      </w:r>
+      <w:r>
+        <w:rPr>
+          <w:b/>
+          <w:rFonts w:ascii="Consolas" w:hAnsi="Consolas"/>
+        </w:rPr>
+        <w:t xml:space="preserve">ProcessAsync_EmailServiceThrows_ExceptionDoesNotPropagate</w:t>
+      </w:r>
+      <w:r>
+        <w:t xml:space="preserve"> — Simulated the same email-service failure used against TicketCreatedNotificationService: here the exception was correctly caught and did not escape. </w:t>
+      </w:r>
+      <w:r>
+        <w:t xml:space="preserve">Result: </w:t>
+      </w:r>
+      <w:r>
+        <w:rPr>
+          <w:b/>
+          <w:color w:val="2E7D32"/>
+        </w:rPr>
+        <w:t xml:space="preserve">PASS</w:t>
+      </w:r>
+      <w:r>
+        <w:rPr>
+          <w:i/>
+          <w:color w:val="555555"/>
+        </w:rPr>
+        <w:t xml:space="preserve">  (contrast with BUG-04)</w:t>
+      </w:r>
+    </w:p>
+    <w:p>
+      <w:pPr>
+        <w:spacing w:after="160"/>
+      </w:pPr>
+      <w:r>
+        <w:t xml:space="preserve">This consumer's own logic is correct in isolation — the live crash observed during manual testing was collateral damage from TicketCreatedConsumer's separate, unhandled failure taking down the whole Notification.Api host (ASP.NET Core's default BackgroundServiceExceptionBehavior.StopHost policy), not a defect in this consumer. </w:t>
+      </w:r>
+      <w:r>
+        <w:rPr>
+          <w:b/>
           <w:color w:val="C62828"/>
         </w:rPr>
-        <w:t xml:space="preserve">FAIL</w:t>
-      </w:r>
-      <w:r>
-        <w:rPr>
-          <w:i/>
-          <w:iCs/>
-          <w:color w:val="555555"/>
-        </w:rPr>
-        <w:t xml:space="preserve">  (AC1/AC2)</w:t>
+        <w:t xml:space="preserve">→ See BUG-04 and BUG-05.</w:t>
       </w:r>
     </w:p>
     <w:p>
@@ -1190,64 +1462,11 @@
         <w:spacing w:after="160"/>
       </w:pPr>
       <w:r>
-        <w:rPr>
-          <w:b/>
-          <w:bCs/>
-          <w:color w:val="C62828"/>
-        </w:rPr>
-        <w:t xml:space="preserve">→ See BUG-04: Notification.Api crashes (and crash-loops) on any SMTP failure, and BUG-05: the message is then lost, not retried.</w:t>
-      </w:r>
-    </w:p>
-    <w:p>
-      <w:pPr>
-        <w:spacing w:after="140"/>
-      </w:pPr>
-      <w:r>
-        <w:rPr>
-          <w:b/>
-          <w:bCs/>
-        </w:rPr>
-        <w:t xml:space="preserve">3. </w:t>
-      </w:r>
-      <w:r>
-        <w:rPr>
-          <w:rFonts w:ascii="Consolas" w:cs="Consolas" w:eastAsia="Consolas" w:hAnsi="Consolas"/>
-          <w:b/>
-          <w:bCs/>
-        </w:rPr>
-        <w:t xml:space="preserve">SlaBreached_ForAlreadyResolvedTicket_ShouldNeverFire</w:t>
-      </w:r>
-      <w:r>
-        <w:t xml:space="preserve"> — A breach alert was generated for a ticket that had already been resolved — see SLA-3 above. </w:t>
-      </w:r>
-      <w:r>
-        <w:t xml:space="preserve">Result: </w:t>
-      </w:r>
-      <w:r>
-        <w:rPr>
-          <w:b/>
-          <w:bCs/>
-          <w:color w:val="C62828"/>
-        </w:rPr>
-        <w:t xml:space="preserve">FAIL</w:t>
-      </w:r>
-      <w:r>
-        <w:rPr>
-          <w:i/>
-          <w:iCs/>
-          <w:color w:val="555555"/>
-        </w:rPr>
-        <w:t xml:space="preserve">  (AC2 (intent))</w:t>
-      </w:r>
-    </w:p>
-    <w:p>
-      <w:pPr>
-        <w:spacing w:after="160"/>
-      </w:pPr>
-      <w:r>
-        <w:rPr>
-          <w:b/>
-          <w:bCs/>
+        <w:t xml:space="preserve">Ticket resolution is not modelled here either (see the SLA-3 note above), so AC2's “never alert on an already-resolved ticket” intent remains verified only manually. </w:t>
+      </w:r>
+      <w:r>
+        <w:rPr>
+          <w:b/>
           <w:color w:val="C62828"/>
         </w:rPr>
         <w:t xml:space="preserve">→ See BUG-06.</w:t>
@@ -1754,6 +1973,94 @@
     </w:p>
     <w:p>
       <w:pPr>
+        <w:pStyle w:val="Heading3"/>
+        <w:spacing w:after="100" w:before="200"/>
+      </w:pPr>
+      <w:r>
+        <w:rPr>
+          <w:b/>
+        </w:rPr>
+        <w:t xml:space="preserve">XUnit Test Cases (automated — Ticket.Api.Tests, TicketReportDateFilterTests):</w:t>
+      </w:r>
+    </w:p>
+    <w:p>
+      <w:pPr>
+        <w:spacing w:after="140"/>
+      </w:pPr>
+      <w:r>
+        <w:rPr>
+          <w:b/>
+        </w:rPr>
+        <w:t xml:space="preserve">1. </w:t>
+      </w:r>
+      <w:r>
+        <w:rPr>
+          <w:b/>
+          <w:rFonts w:ascii="Consolas" w:hAnsi="Consolas"/>
+        </w:rPr>
+        <w:t xml:space="preserve">ToUtcStartBoundary_UnspecifiedKindInput_ShouldBeTreatedAsUtc</w:t>
+      </w:r>
+      <w:r>
+        <w:t xml:space="preserve"> — A date-only query value (DateTimeKind.Unspecified) should mean midnight UTC on that date; on this UTC+5:30 host it instead computed a boundary 5 hours 30 minutes earlier. </w:t>
+      </w:r>
+      <w:r>
+        <w:t xml:space="preserve">Result: </w:t>
+      </w:r>
+      <w:r>
+        <w:rPr>
+          <w:b/>
+          <w:color w:val="C62828"/>
+        </w:rPr>
+        <w:t xml:space="preserve">FAIL</w:t>
+      </w:r>
+      <w:r>
+        <w:rPr>
+          <w:i/>
+          <w:color w:val="555555"/>
+        </w:rPr>
+        <w:t xml:space="preserve">  (BUG-07)</w:t>
+      </w:r>
+    </w:p>
+    <w:p>
+      <w:pPr>
+        <w:spacing w:after="140"/>
+      </w:pPr>
+      <w:r>
+        <w:rPr>
+          <w:b/>
+        </w:rPr>
+        <w:t xml:space="preserve">2. </w:t>
+      </w:r>
+      <w:r>
+        <w:rPr>
+          <w:b/>
+          <w:rFonts w:ascii="Consolas" w:hAnsi="Consolas"/>
+        </w:rPr>
+        <w:t xml:space="preserve">ToUtcEndBoundary_UnspecifiedKindInput_ShouldBeTreatedAsUtc</w:t>
+      </w:r>
+      <w:r>
+        <w:t xml:space="preserve"> — Same defect against the end-of-range boundary — shifted by the same 5 hours 30 minutes. </w:t>
+      </w:r>
+      <w:r>
+        <w:t xml:space="preserve">Result: </w:t>
+      </w:r>
+      <w:r>
+        <w:rPr>
+          <w:b/>
+          <w:color w:val="C62828"/>
+        </w:rPr>
+        <w:t xml:space="preserve">FAIL</w:t>
+      </w:r>
+      <w:r>
+        <w:rPr>
+          <w:i/>
+          <w:color w:val="555555"/>
+        </w:rPr>
+        <w:t xml:space="preserve">  (BUG-07)</w:t>
+      </w:r>
+    </w:p>
+    <w:p>
+      <w:pPr>
         <w:pStyle w:val="Heading1"/>
         <w:spacing w:after="160" w:before="320"/>
       </w:pPr>
@@ -2615,6 +2922,65 @@
           </w:p>
         </w:tc>
       </w:tr>
+      <w:tr>
+        <w:tc>
+          <w:tcPr>
+            <w:tcW w:type="dxa" w:w="900"/>
+          </w:tcPr>
+          <w:p>
+            <w:r>
+              <w:rPr>
+                <w:b/>
+              </w:rPr>
+              <w:t xml:space="preserve">BUG-08</w:t>
+            </w:r>
+          </w:p>
+        </w:tc>
+        <w:tc>
+          <w:tcPr>
+            <w:tcW w:type="dxa" w:w="4200"/>
+          </w:tcPr>
+          <w:p>
+            <w:r>
+              <w:t xml:space="preserve">A transient DB failure after a Kafka publish causes the same SLA breach to be republished</w:t>
+            </w:r>
+          </w:p>
+        </w:tc>
+        <w:tc>
+          <w:tcPr>
+            <w:tcW w:type="dxa" w:w="1300"/>
+          </w:tcPr>
+          <w:p>
+            <w:r>
+              <w:rPr>
+                <w:b/>
+                <w:color w:val="B8860B"/>
+              </w:rPr>
+              <w:t xml:space="preserve">High</w:t>
+            </w:r>
+          </w:p>
+        </w:tc>
+        <w:tc>
+          <w:tcPr>
+            <w:tcW w:type="dxa" w:w="1100"/>
+          </w:tcPr>
+          <w:p>
+            <w:r>
+              <w:t xml:space="preserve">Open</w:t>
+            </w:r>
+          </w:p>
+        </w:tc>
+        <w:tc>
+          <w:tcPr>
+            <w:tcW w:type="dxa" w:w="1500"/>
+          </w:tcPr>
+          <w:p>
+            <w:r>
+              <w:t xml:space="preserve">SLA-3</w:t>
+            </w:r>
+          </w:p>
+        </w:tc>
+      </w:tr>
     </w:tbl>
     <w:p>
       <w:pPr>
@@ -2646,7 +3012,7 @@
         <w:spacing w:after="160"/>
       </w:pPr>
       <w:r>
-        <w:t xml:space="preserve">What does not: the SLA breach monitor has no way to learn that a ticket was resolved, so it will confidently alert on tickets that were closed within seconds of being opened (BUG-06). The notification pipeline's reliability model has a serious structural gap — a single unhandled exception (triggered here simply by missing SMTP configuration) does not just fail one email, it takes down the entire Notification.Api process, and whatever message was mid-flight at that moment is silently and permanently lost, with no error, no retry, and no trace (BUG-04, BUG-05). The dynamic report's date filtering is not deployment-safe: the exact same request returns different tickets depending on what timezone the host server happens to be configured with (BUG-07).</w:t>
+        <w:t xml:space="preserve">What does not: the SLA breach monitor has no way to learn that a ticket was resolved, so it will confidently alert on tickets that were closed within seconds of being opened (BUG-06). The breach-detection service also has a narrower but still real correctness gap of its own: if the database write that durably records a breach fails right after the Kafka alert for it has already gone out, the same breach gets alerted on again next cycle — proven with a deterministic regression test rather than found by chance (BUG-08). The notification pipeline's reliability model has a serious structural gap — a single unhandled exception (triggered here simply by missing SMTP configuration) does not just fail one email, it takes down the entire Notification.Api process, and whatever message was mid-flight at that moment is silently and permanently lost, with no error, no retry, and no trace (BUG-04, BUG-05). The dynamic report's date filtering is not deployment-safe: the exact same request returns different tickets depending on what timezone the host server happens to be configured with (BUG-07).</w:t>
       </w:r>
     </w:p>
     <w:p>
@@ -2662,7 +3028,7 @@
         <w:spacing w:after="160"/>
       </w:pPr>
       <w:r>
-        <w:t xml:space="preserve">Together, these results argue for two concrete next steps before this sprint's features are considered demo-ready: closing the SLA status-update gap so resolved tickets can never falsely breach, and hardening the notification consumers so a single send failure degrades gracefully instead of silently destroying data and taking the whole service down with it. The Selenium suite introduced this sprint is intentionally structured to keep growing as a regression guard — the same three-line pattern (drive the real app, assert the real DOM, screenshot on failure) can now be extended to cover BUG-06 and BUG-07 as failing tests that will turn green the moment each is actually fixed.</w:t>
+        <w:t xml:space="preserve">Together, these results argue for two concrete next steps before this sprint's features are considered demo-ready: closing the SLA status-update gap so resolved tickets can never falsely breach, and hardening the notification and breach-detection consumers so a single send or save failure degrades gracefully instead of silently destroying data or duplicating alerts. This sprint introduced a matching xUnit regression suite alongside the Selenium one, built on the same principle — exercise the real code, assert the correct behaviour, let a genuine bug show up as a red test — which already turns BUG-04, BUG-07, and BUG-08 into reproducible, automated failures today; extending it to cover BUG-06 once Sla.Api can learn about ticket resolution is the natural next step.</w:t>
       </w:r>
     </w:p>
     <w:sectPr>

</xml_diff>